<commit_message>
Programacion II: cada lamina de codigo es un Main.java completo que compila y corre solo, verificado con javac
Co-Authored-By: Claude Opus 5.5 <noreply@anthropic.com>
</commit_message>
<xml_diff>
--- a/Programacion II/Kit docente/Clase 1/Guion Docente Clase 1 - Introduccion a POO.docx
+++ b/Programacion II/Kit docente/Clase 1/Guion Docente Clase 1 - Introduccion a POO.docx
@@ -369,7 +369,7 @@
           <w:color w:val="4A4A49"/>
           <w:sz w:val="22"/>
         </w:rPr>
-        <w:t xml:space="preserve"> — codigo (8 lineas). Leerlo de arriba abajo y ejecutarlo en la demo.</w:t>
+        <w:t xml:space="preserve"> — programa completo (33 lineas): se copia en Main.java y corre solo. Leerlo de arriba abajo y ejecutarlo; la salida esperada esta en las notas del presentador.</w:t>
       </w:r>
     </w:p>
     <w:p>
@@ -602,7 +602,7 @@
           <w:color w:val="4A4A49"/>
           <w:sz w:val="22"/>
         </w:rPr>
-        <w:t xml:space="preserve"> — codigo (8 lineas). Leerlo de arriba abajo y ejecutarlo en la demo.</w:t>
+        <w:t xml:space="preserve"> — programa completo (35 lineas): se copia en Main.java y corre solo. Leerlo de arriba abajo y ejecutarlo; la salida esperada esta en las notas del presentador.</w:t>
       </w:r>
     </w:p>
     <w:p>
@@ -695,7 +695,7 @@
           <w:color w:val="4A4A49"/>
           <w:sz w:val="22"/>
         </w:rPr>
-        <w:t xml:space="preserve"> — codigo (11 lineas). Leerlo de arriba abajo y ejecutarlo en la demo.</w:t>
+        <w:t xml:space="preserve"> — programa completo (29 lineas): se copia en Main.java y corre solo. Leerlo de arriba abajo y ejecutarlo; la salida esperada esta en las notas del presentador.</w:t>
       </w:r>
     </w:p>
     <w:p>

</xml_diff>